<commit_message>
updates and add bib icon link
</commit_message>
<xml_diff>
--- a/docs/out/peds-cv-brokamp.docx
+++ b/docs/out/peds-cv-brokamp.docx
@@ -5314,7 +5314,7 @@
         <w:t xml:space="preserve">AMIA Summits on Translational Science Proceedings</w:t>
       </w:r>
       <w:r>
-        <w:t xml:space="preserve">. In Press. 2026.</w:t>
+        <w:t xml:space="preserve">. 183–192. 2026.</w:t>
       </w:r>
     </w:p>
     <w:p>
@@ -9816,7 +9816,7 @@
         <w:pStyle w:val="BodyText"/>
       </w:pPr>
       <w:r>
-        <w:t xml:space="preserve">Date of Preparation: 2026-06-17</w:t>
+        <w:t xml:space="preserve">Date of Preparation: 2026-06-29</w:t>
       </w:r>
     </w:p>
     <w:bookmarkEnd w:id="58"/>

</xml_diff>